<commit_message>
feat(class-toolkit): embed Andika font in DOCX for cross-platform rendering
Templates now embed Andika (SIL OFL literacy font) using OOXML font embedding
so Word documents render correctly on any OS without requiring font installation.

Key changes:
- Added Andika font files (Regular, Bold, Italic, BoldItalic) and OFL license
- Created embed-fonts.py to embed fonts into DOCX files post-pandoc
- Simplified generate-templates.py to use single Andika font for all year levels
- Updated generate-resource and init-class skills to copy fonts and run embedding
- Regenerated all 8 reference templates with Andika

Since pandoc strips embedded fonts from --reference-doc, fonts are embedded as a
post-processing step on each generated document. This guarantees correct rendering
regardless of system font availability.

Bumped version to 0.5.0.
</commit_message>
<xml_diff>
--- a/class-toolkit/templates/year-1-ref.docx
+++ b/class-toolkit/templates/year-1-ref.docx
@@ -545,7 +545,7 @@
   <w:docDefaults>
     <w:rPrDefault>
       <w:rPr>
-        <w:rFonts w:ascii="Comic Sans MS" w:hAnsi="Comic Sans MS" w:eastAsia="Comic Sans MS" w:cs="Comic Sans MS"/>
+        <w:rFonts w:ascii="Andika" w:hAnsi="Andika" w:eastAsia="Andika" w:cs="Andika"/>
         <w:sz w:val="48"/>
         <w:szCs w:val="48"/>
         <w:lang w:val="en-US" w:eastAsia="en-US" w:bidi="ar-SA"/>
@@ -563,7 +563,7 @@
     <w:name w:val="Normal"/>
     <w:qFormat/>
     <w:rPr>
-      <w:rFonts w:ascii="Comic Sans MS" w:hAnsi="Comic Sans MS" w:eastAsia="Comic Sans MS" w:cs="Comic Sans MS"/>
+      <w:rFonts w:ascii="Andika" w:hAnsi="Andika" w:eastAsia="Andika" w:cs="Andika"/>
       <w:sz w:val="48"/>
       <w:szCs w:val="48"/>
       <w:spacing w:val="20"/>
@@ -583,7 +583,7 @@
     </w:pPr>
     <w:qFormat/>
     <w:rPr>
-      <w:rFonts w:ascii="Comic Sans MS" w:hAnsi="Comic Sans MS" w:eastAsia="Comic Sans MS" w:cs="Comic Sans MS"/>
+      <w:rFonts w:ascii="Andika" w:hAnsi="Andika" w:eastAsia="Andika" w:cs="Andika"/>
       <w:sz w:val="48"/>
       <w:szCs w:val="48"/>
       <w:spacing w:val="20"/>
@@ -595,7 +595,7 @@
     <w:next w:val="BodyText"/>
     <w:qFormat/>
     <w:rPr>
-      <w:rFonts w:ascii="Comic Sans MS" w:hAnsi="Comic Sans MS" w:eastAsia="Comic Sans MS" w:cs="Comic Sans MS"/>
+      <w:rFonts w:ascii="Andika" w:hAnsi="Andika" w:eastAsia="Andika" w:cs="Andika"/>
       <w:sz w:val="48"/>
       <w:szCs w:val="48"/>
       <w:spacing w:val="20"/>
@@ -614,7 +614,7 @@
       <w:jc w:val="left"/>
     </w:pPr>
     <w:rPr>
-      <w:rFonts w:ascii="Comic Sans MS" w:hAnsi="Comic Sans MS" w:eastAsia="Comic Sans MS" w:cs="Comic Sans MS"/>
+      <w:rFonts w:ascii="Andika" w:hAnsi="Andika" w:eastAsia="Andika" w:cs="Andika"/>
       <w:sz w:val="48"/>
       <w:szCs w:val="48"/>
       <w:spacing w:val="20"/>
@@ -632,7 +632,7 @@
       <w:jc w:val="left"/>
     </w:pPr>
     <w:rPr>
-      <w:rFonts w:ascii="Comic Sans MS" w:hAnsi="Comic Sans MS" w:eastAsia="Comic Sans MS" w:cs="Comic Sans MS"/>
+      <w:rFonts w:ascii="Andika" w:hAnsi="Andika" w:eastAsia="Andika" w:cs="Andika"/>
       <w:b/>
       <w:bCs/>
       <w:color w:val="345A8A" w:themeColor="accent1" w:themeShade="B5"/>
@@ -655,7 +655,7 @@
     <w:rPr>
       <w:sz w:val="60"/>
       <w:szCs w:val="60"/>
-      <w:rFonts w:ascii="Comic Sans MS" w:hAnsi="Comic Sans MS" w:eastAsia="Comic Sans MS" w:cs="Comic Sans MS"/>
+      <w:rFonts w:ascii="Andika" w:hAnsi="Andika" w:eastAsia="Andika" w:cs="Andika"/>
       <w:spacing w:val="20"/>
     </w:rPr>
   </w:style>
@@ -735,7 +735,7 @@
       <w:jc w:val="left"/>
     </w:pPr>
     <w:rPr>
-      <w:rFonts w:ascii="Comic Sans MS" w:hAnsi="Comic Sans MS" w:eastAsia="Comic Sans MS" w:cs="Comic Sans MS"/>
+      <w:rFonts w:ascii="Andika" w:hAnsi="Andika" w:eastAsia="Andika" w:cs="Andika"/>
       <w:b/>
       <w:bCs/>
       <w:color w:val="4F81BD" w:themeColor="accent1"/>
@@ -759,7 +759,7 @@
       <w:jc w:val="left"/>
     </w:pPr>
     <w:rPr>
-      <w:rFonts w:ascii="Comic Sans MS" w:hAnsi="Comic Sans MS" w:eastAsia="Comic Sans MS" w:cs="Comic Sans MS"/>
+      <w:rFonts w:ascii="Andika" w:hAnsi="Andika" w:eastAsia="Andika" w:cs="Andika"/>
       <w:b/>
       <w:bCs/>
       <w:color w:val="4F81BD" w:themeColor="accent1"/>
@@ -783,7 +783,7 @@
       <w:jc w:val="left"/>
     </w:pPr>
     <w:rPr>
-      <w:rFonts w:ascii="Comic Sans MS" w:hAnsi="Comic Sans MS" w:eastAsia="Comic Sans MS" w:cs="Comic Sans MS"/>
+      <w:rFonts w:ascii="Andika" w:hAnsi="Andika" w:eastAsia="Andika" w:cs="Andika"/>
       <w:b/>
       <w:bCs/>
       <w:color w:val="4F81BD" w:themeColor="accent1"/>
@@ -807,7 +807,7 @@
       <w:jc w:val="left"/>
     </w:pPr>
     <w:rPr>
-      <w:rFonts w:ascii="Comic Sans MS" w:hAnsi="Comic Sans MS" w:eastAsia="Comic Sans MS" w:cs="Comic Sans MS"/>
+      <w:rFonts w:ascii="Andika" w:hAnsi="Andika" w:eastAsia="Andika" w:cs="Andika"/>
       <w:i/>
       <w:bCs/>
       <w:color w:val="4F81BD" w:themeColor="accent1"/>
@@ -831,7 +831,7 @@
       <w:jc w:val="left"/>
     </w:pPr>
     <w:rPr>
-      <w:rFonts w:ascii="Comic Sans MS" w:hAnsi="Comic Sans MS" w:eastAsia="Comic Sans MS" w:cs="Comic Sans MS"/>
+      <w:rFonts w:ascii="Andika" w:hAnsi="Andika" w:eastAsia="Andika" w:cs="Andika"/>
       <w:iCs/>
       <w:color w:val="4F81BD" w:themeColor="accent1"/>
       <w:sz w:val="52"/>
@@ -932,7 +932,7 @@
       <w:jc w:val="left"/>
     </w:pPr>
     <w:rPr>
-      <w:rFonts w:ascii="Comic Sans MS" w:hAnsi="Comic Sans MS" w:eastAsia="Comic Sans MS" w:cs="Comic Sans MS"/>
+      <w:rFonts w:ascii="Andika" w:hAnsi="Andika" w:eastAsia="Andika" w:cs="Andika"/>
       <w:sz w:val="48"/>
       <w:szCs w:val="48"/>
       <w:spacing w:val="20"/>

</xml_diff>

<commit_message>
feat(class-toolkit): set A4 page size in reference docx templates
Add set_page_size_a4() to modify document.xml section properties with A4
dimensions (11906x16838 twips). All 8 year-level templates now use A4 instead
of inheriting pandoc's Letter default.
</commit_message>
<xml_diff>
--- a/class-toolkit/templates/year-1-ref.docx
+++ b/class-toolkit/templates/year-1-ref.docx
@@ -1,6 +1,6 @@
 
 <file path=word/document.xml><?xml version="1.0" encoding="utf-8"?>
-<w:document xmlns:w="http://schemas.openxmlformats.org/wordprocessingml/2006/main" xmlns:m="http://schemas.openxmlformats.org/officeDocument/2006/math" xmlns:r="http://schemas.openxmlformats.org/officeDocument/2006/relationships" xmlns:o="urn:schemas-microsoft-com:office:office" xmlns:v="urn:schemas-microsoft-com:vml" xmlns:w10="urn:schemas-microsoft-com:office:word" xmlns:a="http://schemas.openxmlformats.org/drawingml/2006/main" xmlns:pic="http://schemas.openxmlformats.org/drawingml/2006/picture" xmlns:wp="http://schemas.openxmlformats.org/drawingml/2006/wordprocessingDrawing">
+<w:document xmlns:r="http://schemas.openxmlformats.org/officeDocument/2006/relationships" xmlns:w="http://schemas.openxmlformats.org/wordprocessingml/2006/main">
   <w:body>
     <w:p>
       <w:pPr>
@@ -382,7 +382,9 @@
 </w:t>
       </w:r>
     </w:p>
-    <w:sectPr/>
+    <w:sectPr>
+      <w:pgSz w:w="11906" w:h="16838"/>
+    </w:sectPr>
   </w:body>
 </w:document>
 </file>

</xml_diff>

<commit_message>
feat(class-toolkit): add footer with page numbers to templates
Add footer functionality to reference templates showing "Year N Template — Page X".
Includes new XML generation functions for footer creation, relationship management,
and content type registration. All 8 year-level templates regenerated with footers.
</commit_message>
<xml_diff>
--- a/class-toolkit/templates/year-1-ref.docx
+++ b/class-toolkit/templates/year-1-ref.docx
@@ -384,6 +384,7 @@
     </w:p>
     <w:sectPr>
       <w:pgSz w:w="11906" w:h="16838"/>
+      <w:footerReference w:type="default" r:id="rId9"/>
     </w:sectPr>
   </w:body>
 </w:document>
@@ -391,6 +392,48 @@
 
 <file path=word/comments.xml><?xml version="1.0" encoding="utf-8"?>
 <w:comments xmlns:w="http://schemas.openxmlformats.org/wordprocessingml/2006/main" xmlns:m="http://schemas.openxmlformats.org/officeDocument/2006/math" xmlns:r="http://schemas.openxmlformats.org/officeDocument/2006/relationships" xmlns:o="urn:schemas-microsoft-com:office:office" xmlns:v="urn:schemas-microsoft-com:vml" xmlns:w10="urn:schemas-microsoft-com:office:word" xmlns:a="http://schemas.openxmlformats.org/drawingml/2006/main" xmlns:pic="http://schemas.openxmlformats.org/drawingml/2006/picture" xmlns:wp="http://schemas.openxmlformats.org/drawingml/2006/wordprocessingDrawing"/>
+</file>
+
+<file path=word/footer1.xml><?xml version="1.0" encoding="utf-8"?>
+<w:ftr xmlns:w="http://schemas.openxmlformats.org/wordprocessingml/2006/main">
+  <w:p>
+    <w:pPr>
+      <w:jc w:val="right"/>
+    </w:pPr>
+    <w:r>
+      <w:rPr>
+        <w:sz w:val="16"/>
+        <w:szCs w:val="16"/>
+        <w:color w:val="808080"/>
+      </w:rPr>
+      <w:t xml:space="preserve">Year 1 Template — Page </w:t>
+    </w:r>
+    <w:r>
+      <w:rPr>
+        <w:sz w:val="16"/>
+        <w:szCs w:val="16"/>
+        <w:color w:val="808080"/>
+      </w:rPr>
+      <w:fldChar w:fldCharType="begin"/>
+    </w:r>
+    <w:r>
+      <w:rPr>
+        <w:sz w:val="16"/>
+        <w:szCs w:val="16"/>
+        <w:color w:val="808080"/>
+      </w:rPr>
+      <w:instrText xml:space="preserve"> PAGE </w:instrText>
+    </w:r>
+    <w:r>
+      <w:rPr>
+        <w:sz w:val="16"/>
+        <w:szCs w:val="16"/>
+        <w:color w:val="808080"/>
+      </w:rPr>
+      <w:fldChar w:fldCharType="end"/>
+    </w:r>
+  </w:p>
+</w:ftr>
 </file>
 
 <file path=word/footnotes.xml><?xml version="1.0" encoding="utf-8"?>

</xml_diff>